<commit_message>
2023 data and Makefile
</commit_message>
<xml_diff>
--- a/10_appendix/output/appendix_c/income_negatives.docx
+++ b/10_appendix/output/appendix_c/income_negatives.docx
@@ -17562,6 +17562,428 @@
         <w:tc>
           <w:tcPr>
             <w:tcBorders>
+              <w:bottom w:val="none" w:sz="0" w:space="0" w:color="000000"/>
+              <w:top w:val="none" w:sz="0" w:space="0" w:color="000000"/>
+              <w:left w:val="none" w:sz="0" w:space="0" w:color="000000"/>
+              <w:right w:val="none" w:sz="0" w:space="0" w:color="000000"/>
+            </w:tcBorders>
+            <w:shd w:val="clear" w:color="auto" w:fill="FFFFFF"/>
+            <w:tcMar>
+              <w:top w:w="0" w:type="dxa"/>
+              <w:bottom w:w="0" w:type="dxa"/>
+              <w:left w:w="0" w:type="dxa"/>
+              <w:right w:w="0" w:type="dxa"/>
+            </w:tcMar>
+            <w:vAlign w:val="center"/>
+          </w:tcPr>
+          <w:p>
+            <w:pPr>
+              <w:jc w:val="center"/>
+              <w:pBdr>
+                <w:bottom w:val="none" w:sz="0" w:space="0" w:color="000000"/>
+                <w:top w:val="none" w:sz="0" w:space="0" w:color="000000"/>
+                <w:left w:val="none" w:sz="0" w:space="0" w:color="000000"/>
+                <w:right w:val="none" w:sz="0" w:space="0" w:color="000000"/>
+              </w:pBdr>
+              <w:spacing w:after="100" w:before="100" w:line="240"/>
+              <w:ind w:left="100" w:right="100" w:firstLine="0" w:firstLineChars="0"/>
+              <w:rPr>
+                <w:rFonts w:ascii="Helvetica" w:hAnsi="Helvetica" w:eastAsia="Helvetica" w:cs="Helvetica"/>
+                <w:i w:val="false"/>
+                <w:b w:val="false"/>
+                <w:u w:val="none"/>
+                <w:sz w:val="22"/>
+                <w:szCs w:val="22"/>
+                <w:color w:val="000000"/>
+              </w:rPr>
+            </w:pPr>
+            <w:r>
+              <w:rPr>
+                <w:rFonts w:ascii="Helvetica" w:hAnsi="Helvetica" w:eastAsia="Helvetica" w:cs="Helvetica"/>
+                <w:i w:val="false"/>
+                <w:b w:val="false"/>
+                <w:u w:val="none"/>
+                <w:sz w:val="22"/>
+                <w:szCs w:val="22"/>
+                <w:color w:val="000000"/>
+              </w:rPr>
+              <w:t xml:space="preserve">2021</w:t>
+            </w:r>
+          </w:p>
+        </w:tc>
+        <w:tc>
+          <w:tcPr>
+            <w:tcBorders>
+              <w:bottom w:val="none" w:sz="0" w:space="0" w:color="000000"/>
+              <w:top w:val="none" w:sz="0" w:space="0" w:color="000000"/>
+              <w:left w:val="none" w:sz="0" w:space="0" w:color="000000"/>
+              <w:right w:val="none" w:sz="0" w:space="0" w:color="000000"/>
+            </w:tcBorders>
+            <w:shd w:val="clear" w:color="auto" w:fill="FFFFFF"/>
+            <w:tcMar>
+              <w:top w:w="0" w:type="dxa"/>
+              <w:bottom w:w="0" w:type="dxa"/>
+              <w:left w:w="0" w:type="dxa"/>
+              <w:right w:w="0" w:type="dxa"/>
+            </w:tcMar>
+            <w:vAlign w:val="center"/>
+          </w:tcPr>
+          <w:p>
+            <w:pPr>
+              <w:jc w:val="center"/>
+              <w:pBdr>
+                <w:bottom w:val="none" w:sz="0" w:space="0" w:color="000000"/>
+                <w:top w:val="none" w:sz="0" w:space="0" w:color="000000"/>
+                <w:left w:val="none" w:sz="0" w:space="0" w:color="000000"/>
+                <w:right w:val="none" w:sz="0" w:space="0" w:color="000000"/>
+              </w:pBdr>
+              <w:spacing w:after="100" w:before="100" w:line="240"/>
+              <w:ind w:left="100" w:right="100" w:firstLine="0" w:firstLineChars="0"/>
+              <w:rPr>
+                <w:rFonts w:ascii="Helvetica" w:hAnsi="Helvetica" w:eastAsia="Helvetica" w:cs="Helvetica"/>
+                <w:i w:val="false"/>
+                <w:b w:val="false"/>
+                <w:u w:val="none"/>
+                <w:sz w:val="22"/>
+                <w:szCs w:val="22"/>
+                <w:color w:val="000000"/>
+              </w:rPr>
+            </w:pPr>
+            <w:r>
+              <w:rPr>
+                <w:rFonts w:ascii="Helvetica" w:hAnsi="Helvetica" w:eastAsia="Helvetica" w:cs="Helvetica"/>
+                <w:i w:val="false"/>
+                <w:b w:val="false"/>
+                <w:u w:val="none"/>
+                <w:sz w:val="22"/>
+                <w:szCs w:val="22"/>
+                <w:color w:val="000000"/>
+              </w:rPr>
+              <w:t xml:space="preserve">0.505</w:t>
+            </w:r>
+          </w:p>
+        </w:tc>
+        <w:tc>
+          <w:tcPr>
+            <w:tcBorders>
+              <w:bottom w:val="none" w:sz="0" w:space="0" w:color="000000"/>
+              <w:top w:val="none" w:sz="0" w:space="0" w:color="000000"/>
+              <w:left w:val="none" w:sz="0" w:space="0" w:color="000000"/>
+              <w:right w:val="none" w:sz="0" w:space="0" w:color="000000"/>
+            </w:tcBorders>
+            <w:shd w:val="clear" w:color="auto" w:fill="FFFFFF"/>
+            <w:tcMar>
+              <w:top w:w="0" w:type="dxa"/>
+              <w:bottom w:w="0" w:type="dxa"/>
+              <w:left w:w="0" w:type="dxa"/>
+              <w:right w:w="0" w:type="dxa"/>
+            </w:tcMar>
+            <w:vAlign w:val="center"/>
+          </w:tcPr>
+          <w:p>
+            <w:pPr>
+              <w:jc w:val="center"/>
+              <w:pBdr>
+                <w:bottom w:val="none" w:sz="0" w:space="0" w:color="000000"/>
+                <w:top w:val="none" w:sz="0" w:space="0" w:color="000000"/>
+                <w:left w:val="none" w:sz="0" w:space="0" w:color="000000"/>
+                <w:right w:val="none" w:sz="0" w:space="0" w:color="000000"/>
+              </w:pBdr>
+              <w:spacing w:after="100" w:before="100" w:line="240"/>
+              <w:ind w:left="100" w:right="100" w:firstLine="0" w:firstLineChars="0"/>
+              <w:rPr>
+                <w:rFonts w:ascii="Helvetica" w:hAnsi="Helvetica" w:eastAsia="Helvetica" w:cs="Helvetica"/>
+                <w:i w:val="false"/>
+                <w:b w:val="false"/>
+                <w:u w:val="none"/>
+                <w:sz w:val="22"/>
+                <w:szCs w:val="22"/>
+                <w:color w:val="000000"/>
+              </w:rPr>
+            </w:pPr>
+            <w:r>
+              <w:rPr>
+                <w:rFonts w:ascii="Helvetica" w:hAnsi="Helvetica" w:eastAsia="Helvetica" w:cs="Helvetica"/>
+                <w:i w:val="false"/>
+                <w:b w:val="false"/>
+                <w:u w:val="none"/>
+                <w:sz w:val="22"/>
+                <w:szCs w:val="22"/>
+                <w:color w:val="000000"/>
+              </w:rPr>
+              <w:t xml:space="preserve">0.460</w:t>
+            </w:r>
+          </w:p>
+        </w:tc>
+        <w:tc>
+          <w:tcPr>
+            <w:tcBorders>
+              <w:bottom w:val="none" w:sz="0" w:space="0" w:color="000000"/>
+              <w:top w:val="none" w:sz="0" w:space="0" w:color="000000"/>
+              <w:left w:val="none" w:sz="0" w:space="0" w:color="000000"/>
+              <w:right w:val="none" w:sz="0" w:space="0" w:color="000000"/>
+            </w:tcBorders>
+            <w:shd w:val="clear" w:color="auto" w:fill="FFFFFF"/>
+            <w:tcMar>
+              <w:top w:w="0" w:type="dxa"/>
+              <w:bottom w:w="0" w:type="dxa"/>
+              <w:left w:w="0" w:type="dxa"/>
+              <w:right w:w="0" w:type="dxa"/>
+            </w:tcMar>
+            <w:vAlign w:val="center"/>
+          </w:tcPr>
+          <w:p>
+            <w:pPr>
+              <w:jc w:val="center"/>
+              <w:pBdr>
+                <w:bottom w:val="none" w:sz="0" w:space="0" w:color="000000"/>
+                <w:top w:val="none" w:sz="0" w:space="0" w:color="000000"/>
+                <w:left w:val="none" w:sz="0" w:space="0" w:color="000000"/>
+                <w:right w:val="none" w:sz="0" w:space="0" w:color="000000"/>
+              </w:pBdr>
+              <w:spacing w:after="100" w:before="100" w:line="240"/>
+              <w:ind w:left="100" w:right="100" w:firstLine="0" w:firstLineChars="0"/>
+              <w:rPr>
+                <w:rFonts w:ascii="Helvetica" w:hAnsi="Helvetica" w:eastAsia="Helvetica" w:cs="Helvetica"/>
+                <w:i w:val="false"/>
+                <w:b w:val="false"/>
+                <w:u w:val="none"/>
+                <w:sz w:val="22"/>
+                <w:szCs w:val="22"/>
+                <w:color w:val="000000"/>
+              </w:rPr>
+            </w:pPr>
+            <w:r>
+              <w:rPr>
+                <w:rFonts w:ascii="Helvetica" w:hAnsi="Helvetica" w:eastAsia="Helvetica" w:cs="Helvetica"/>
+                <w:i w:val="false"/>
+                <w:b w:val="false"/>
+                <w:u w:val="none"/>
+                <w:sz w:val="22"/>
+                <w:szCs w:val="22"/>
+                <w:color w:val="000000"/>
+              </w:rPr>
+              <w:t xml:space="preserve">0.045</w:t>
+            </w:r>
+          </w:p>
+        </w:tc>
+        <w:tc>
+          <w:tcPr>
+            <w:tcBorders>
+              <w:bottom w:val="none" w:sz="0" w:space="0" w:color="000000"/>
+              <w:top w:val="none" w:sz="0" w:space="0" w:color="000000"/>
+              <w:left w:val="none" w:sz="0" w:space="0" w:color="000000"/>
+              <w:right w:val="none" w:sz="0" w:space="0" w:color="000000"/>
+            </w:tcBorders>
+            <w:shd w:val="clear" w:color="auto" w:fill="FFFFFF"/>
+            <w:tcMar>
+              <w:top w:w="0" w:type="dxa"/>
+              <w:bottom w:w="0" w:type="dxa"/>
+              <w:left w:w="0" w:type="dxa"/>
+              <w:right w:w="0" w:type="dxa"/>
+            </w:tcMar>
+            <w:vAlign w:val="center"/>
+          </w:tcPr>
+          <w:p>
+            <w:pPr>
+              <w:jc w:val="center"/>
+              <w:pBdr>
+                <w:bottom w:val="none" w:sz="0" w:space="0" w:color="000000"/>
+                <w:top w:val="none" w:sz="0" w:space="0" w:color="000000"/>
+                <w:left w:val="none" w:sz="0" w:space="0" w:color="000000"/>
+                <w:right w:val="none" w:sz="0" w:space="0" w:color="000000"/>
+              </w:pBdr>
+              <w:spacing w:after="100" w:before="100" w:line="240"/>
+              <w:ind w:left="100" w:right="100" w:firstLine="0" w:firstLineChars="0"/>
+              <w:rPr>
+                <w:rFonts w:ascii="Helvetica" w:hAnsi="Helvetica" w:eastAsia="Helvetica" w:cs="Helvetica"/>
+                <w:i w:val="false"/>
+                <w:b w:val="false"/>
+                <w:u w:val="none"/>
+                <w:sz w:val="22"/>
+                <w:szCs w:val="22"/>
+                <w:color w:val="000000"/>
+              </w:rPr>
+            </w:pPr>
+            <w:r>
+              <w:rPr>
+                <w:rFonts w:ascii="Helvetica" w:hAnsi="Helvetica" w:eastAsia="Helvetica" w:cs="Helvetica"/>
+                <w:i w:val="false"/>
+                <w:b w:val="false"/>
+                <w:u w:val="none"/>
+                <w:sz w:val="22"/>
+                <w:szCs w:val="22"/>
+                <w:color w:val="000000"/>
+              </w:rPr>
+              <w:t xml:space="preserve">0.508</w:t>
+            </w:r>
+          </w:p>
+        </w:tc>
+        <w:tc>
+          <w:tcPr>
+            <w:tcBorders>
+              <w:bottom w:val="none" w:sz="0" w:space="0" w:color="000000"/>
+              <w:top w:val="none" w:sz="0" w:space="0" w:color="000000"/>
+              <w:left w:val="none" w:sz="0" w:space="0" w:color="000000"/>
+              <w:right w:val="none" w:sz="0" w:space="0" w:color="000000"/>
+            </w:tcBorders>
+            <w:shd w:val="clear" w:color="auto" w:fill="FFFFFF"/>
+            <w:tcMar>
+              <w:top w:w="0" w:type="dxa"/>
+              <w:bottom w:w="0" w:type="dxa"/>
+              <w:left w:w="0" w:type="dxa"/>
+              <w:right w:w="0" w:type="dxa"/>
+            </w:tcMar>
+            <w:vAlign w:val="center"/>
+          </w:tcPr>
+          <w:p>
+            <w:pPr>
+              <w:jc w:val="center"/>
+              <w:pBdr>
+                <w:bottom w:val="none" w:sz="0" w:space="0" w:color="000000"/>
+                <w:top w:val="none" w:sz="0" w:space="0" w:color="000000"/>
+                <w:left w:val="none" w:sz="0" w:space="0" w:color="000000"/>
+                <w:right w:val="none" w:sz="0" w:space="0" w:color="000000"/>
+              </w:pBdr>
+              <w:spacing w:after="100" w:before="100" w:line="240"/>
+              <w:ind w:left="100" w:right="100" w:firstLine="0" w:firstLineChars="0"/>
+              <w:rPr>
+                <w:rFonts w:ascii="Helvetica" w:hAnsi="Helvetica" w:eastAsia="Helvetica" w:cs="Helvetica"/>
+                <w:i w:val="false"/>
+                <w:b w:val="false"/>
+                <w:u w:val="none"/>
+                <w:sz w:val="22"/>
+                <w:szCs w:val="22"/>
+                <w:color w:val="000000"/>
+              </w:rPr>
+            </w:pPr>
+            <w:r>
+              <w:rPr>
+                <w:rFonts w:ascii="Helvetica" w:hAnsi="Helvetica" w:eastAsia="Helvetica" w:cs="Helvetica"/>
+                <w:i w:val="false"/>
+                <w:b w:val="false"/>
+                <w:u w:val="none"/>
+                <w:sz w:val="22"/>
+                <w:szCs w:val="22"/>
+                <w:color w:val="000000"/>
+              </w:rPr>
+              <w:t xml:space="preserve">0.459</w:t>
+            </w:r>
+          </w:p>
+        </w:tc>
+        <w:tc>
+          <w:tcPr>
+            <w:tcBorders>
+              <w:bottom w:val="none" w:sz="0" w:space="0" w:color="000000"/>
+              <w:top w:val="none" w:sz="0" w:space="0" w:color="000000"/>
+              <w:left w:val="none" w:sz="0" w:space="0" w:color="000000"/>
+              <w:right w:val="none" w:sz="0" w:space="0" w:color="000000"/>
+            </w:tcBorders>
+            <w:shd w:val="clear" w:color="auto" w:fill="FFFFFF"/>
+            <w:tcMar>
+              <w:top w:w="0" w:type="dxa"/>
+              <w:bottom w:w="0" w:type="dxa"/>
+              <w:left w:w="0" w:type="dxa"/>
+              <w:right w:w="0" w:type="dxa"/>
+            </w:tcMar>
+            <w:vAlign w:val="center"/>
+          </w:tcPr>
+          <w:p>
+            <w:pPr>
+              <w:jc w:val="center"/>
+              <w:pBdr>
+                <w:bottom w:val="none" w:sz="0" w:space="0" w:color="000000"/>
+                <w:top w:val="none" w:sz="0" w:space="0" w:color="000000"/>
+                <w:left w:val="none" w:sz="0" w:space="0" w:color="000000"/>
+                <w:right w:val="none" w:sz="0" w:space="0" w:color="000000"/>
+              </w:pBdr>
+              <w:spacing w:after="100" w:before="100" w:line="240"/>
+              <w:ind w:left="100" w:right="100" w:firstLine="0" w:firstLineChars="0"/>
+              <w:rPr>
+                <w:rFonts w:ascii="Helvetica" w:hAnsi="Helvetica" w:eastAsia="Helvetica" w:cs="Helvetica"/>
+                <w:i w:val="false"/>
+                <w:b w:val="false"/>
+                <w:u w:val="none"/>
+                <w:sz w:val="22"/>
+                <w:szCs w:val="22"/>
+                <w:color w:val="000000"/>
+              </w:rPr>
+            </w:pPr>
+            <w:r>
+              <w:rPr>
+                <w:rFonts w:ascii="Helvetica" w:hAnsi="Helvetica" w:eastAsia="Helvetica" w:cs="Helvetica"/>
+                <w:i w:val="false"/>
+                <w:b w:val="false"/>
+                <w:u w:val="none"/>
+                <w:sz w:val="22"/>
+                <w:szCs w:val="22"/>
+                <w:color w:val="000000"/>
+              </w:rPr>
+              <w:t xml:space="preserve">0.049</w:t>
+            </w:r>
+          </w:p>
+        </w:tc>
+        <w:tc>
+          <w:tcPr>
+            <w:tcBorders>
+              <w:bottom w:val="none" w:sz="0" w:space="0" w:color="000000"/>
+              <w:top w:val="none" w:sz="0" w:space="0" w:color="000000"/>
+              <w:left w:val="none" w:sz="0" w:space="0" w:color="000000"/>
+              <w:right w:val="none" w:sz="0" w:space="0" w:color="000000"/>
+            </w:tcBorders>
+            <w:shd w:val="clear" w:color="auto" w:fill="FFFFFF"/>
+            <w:tcMar>
+              <w:top w:w="0" w:type="dxa"/>
+              <w:bottom w:w="0" w:type="dxa"/>
+              <w:left w:w="0" w:type="dxa"/>
+              <w:right w:w="0" w:type="dxa"/>
+            </w:tcMar>
+            <w:vAlign w:val="center"/>
+          </w:tcPr>
+          <w:p>
+            <w:pPr>
+              <w:jc w:val="center"/>
+              <w:pBdr>
+                <w:bottom w:val="none" w:sz="0" w:space="0" w:color="000000"/>
+                <w:top w:val="none" w:sz="0" w:space="0" w:color="000000"/>
+                <w:left w:val="none" w:sz="0" w:space="0" w:color="000000"/>
+                <w:right w:val="none" w:sz="0" w:space="0" w:color="000000"/>
+              </w:pBdr>
+              <w:spacing w:after="100" w:before="100" w:line="240"/>
+              <w:ind w:left="100" w:right="100" w:firstLine="0" w:firstLineChars="0"/>
+              <w:rPr>
+                <w:rFonts w:ascii="Helvetica" w:hAnsi="Helvetica" w:eastAsia="Helvetica" w:cs="Helvetica"/>
+                <w:i w:val="false"/>
+                <w:b w:val="false"/>
+                <w:u w:val="none"/>
+                <w:sz w:val="22"/>
+                <w:szCs w:val="22"/>
+                <w:color w:val="000000"/>
+              </w:rPr>
+            </w:pPr>
+            <w:r>
+              <w:rPr>
+                <w:rFonts w:ascii="Helvetica" w:hAnsi="Helvetica" w:eastAsia="Helvetica" w:cs="Helvetica"/>
+                <w:i w:val="false"/>
+                <w:b w:val="false"/>
+                <w:u w:val="none"/>
+                <w:sz w:val="22"/>
+                <w:szCs w:val="22"/>
+                <w:color w:val="000000"/>
+              </w:rPr>
+              <w:t xml:space="preserve">0.004</w:t>
+            </w:r>
+          </w:p>
+        </w:tc>
+      </w:tr>
+      <w:tr>
+        <w:trPr>
+          <w:trHeight w:val="569" w:hRule="auto"/>
+        </w:trPr>
+        body42
+        <w:tc>
+          <w:tcPr>
+            <w:tcBorders>
               <w:bottom w:val="single" w:sz="12" w:space="0" w:color="666666"/>
               <w:top w:val="none" w:sz="0" w:space="0" w:color="000000"/>
               <w:left w:val="none" w:sz="0" w:space="0" w:color="000000"/>
@@ -17607,7 +18029,7 @@
                 <w:szCs w:val="22"/>
                 <w:color w:val="000000"/>
               </w:rPr>
-              <w:t xml:space="preserve">2021</w:t>
+              <w:t xml:space="preserve">2023</w:t>
             </w:r>
           </w:p>
         </w:tc>
@@ -17659,7 +18081,7 @@
                 <w:szCs w:val="22"/>
                 <w:color w:val="000000"/>
               </w:rPr>
-              <w:t xml:space="preserve">0.505</w:t>
+              <w:t xml:space="preserve">0.516</w:t>
             </w:r>
           </w:p>
         </w:tc>
@@ -17711,7 +18133,7 @@
                 <w:szCs w:val="22"/>
                 <w:color w:val="000000"/>
               </w:rPr>
-              <w:t xml:space="preserve">0.460</w:t>
+              <w:t xml:space="preserve">0.465</w:t>
             </w:r>
           </w:p>
         </w:tc>
@@ -17763,7 +18185,7 @@
                 <w:szCs w:val="22"/>
                 <w:color w:val="000000"/>
               </w:rPr>
-              <w:t xml:space="preserve">0.045</w:t>
+              <w:t xml:space="preserve">0.051</w:t>
             </w:r>
           </w:p>
         </w:tc>
@@ -17815,7 +18237,7 @@
                 <w:szCs w:val="22"/>
                 <w:color w:val="000000"/>
               </w:rPr>
-              <w:t xml:space="preserve">0.508</w:t>
+              <w:t xml:space="preserve">0.517</w:t>
             </w:r>
           </w:p>
         </w:tc>
@@ -17867,7 +18289,7 @@
                 <w:szCs w:val="22"/>
                 <w:color w:val="000000"/>
               </w:rPr>
-              <w:t xml:space="preserve">0.459</w:t>
+              <w:t xml:space="preserve">0.465</w:t>
             </w:r>
           </w:p>
         </w:tc>
@@ -17919,7 +18341,7 @@
                 <w:szCs w:val="22"/>
                 <w:color w:val="000000"/>
               </w:rPr>
-              <w:t xml:space="preserve">0.049</w:t>
+              <w:t xml:space="preserve">0.052</w:t>
             </w:r>
           </w:p>
         </w:tc>
@@ -17971,7 +18393,7 @@
                 <w:szCs w:val="22"/>
                 <w:color w:val="000000"/>
               </w:rPr>
-              <w:t xml:space="preserve">0.004</w:t>
+              <w:t xml:space="preserve">0.001</w:t>
             </w:r>
           </w:p>
         </w:tc>

</xml_diff>